<commit_message>
fix: excluye reportes rechazados de los antecedentes
Un reporte rechazado no prueba que la entidad conocía la falla. Se aplica
la misma regla en la semilla, la consulta C05 y sus verificaciones; se
regenera la semilla y la evidencia de índices con las cifras nuevas.
</commit_message>
<xml_diff>
--- a/base-de-datos/documentacion/entrega2/Entrega2_REDA.docx
+++ b/base-de-datos/documentacion/entrega2/Entrega2_REDA.docx
@@ -564,7 +564,7 @@
               <w:rPr>
                 <w:sz w:val="20"/>
               </w:rPr>
-              <w:t>137 reportes de Valledupar, 18 incidentes, 10 casos; simulados y coherentes</w:t>
+              <w:t>137 reportes de Valledupar, 18 incidentes, 9 casos; simulados y coherentes</w:t>
             </w:r>
           </w:p>
         </w:tc>
@@ -1498,7 +1498,7 @@
               <w:rPr>
                 <w:sz w:val="20"/>
               </w:rPr>
-              <w:t>8,88 ms · 3 475 páginas</w:t>
+              <w:t>8,33 ms · 3 476 páginas</w:t>
             </w:r>
           </w:p>
         </w:tc>
@@ -1512,7 +1512,7 @@
               <w:rPr>
                 <w:sz w:val="20"/>
               </w:rPr>
-              <w:t>0,65 ms · 576 páginas</w:t>
+              <w:t>0,58 ms · 574 páginas</w:t>
             </w:r>
           </w:p>
         </w:tc>
@@ -1526,7 +1526,7 @@
               <w:rPr>
                 <w:sz w:val="20"/>
               </w:rPr>
-              <w:t>13,7× más rápido</w:t>
+              <w:t>14× más rápido</w:t>
             </w:r>
           </w:p>
         </w:tc>
@@ -1556,7 +1556,7 @@
               <w:rPr>
                 <w:sz w:val="20"/>
               </w:rPr>
-              <w:t>40,35 ms · Seq Scan de 400 206 filas</w:t>
+              <w:t>39,71 ms · Seq Scan de ≈ 400 000 filas</w:t>
             </w:r>
           </w:p>
         </w:tc>
@@ -1570,7 +1570,7 @@
               <w:rPr>
                 <w:sz w:val="20"/>
               </w:rPr>
-              <w:t>0,074 ms · 8 páginas</w:t>
+              <w:t>0,064 ms · 8 páginas</w:t>
             </w:r>
           </w:p>
         </w:tc>
@@ -1584,7 +1584,7 @@
               <w:rPr>
                 <w:sz w:val="20"/>
               </w:rPr>
-              <w:t>≈ 500× más rápido</w:t>
+              <w:t>≈ 600× más rápido</w:t>
             </w:r>
           </w:p>
         </w:tc>

</xml_diff>

<commit_message>
feat: agrega migración 009 con la situación pública de cada caso
La vista v_mapa_publico clasifica cada reporte en ABIERTO, CON_ABOGADO o
CERRADO. La semilla reparte los estados de caso en ciclo fijo para que
siempre haya las tres situaciones. Se actualizan cifras, diccionario y PDF.
</commit_message>
<xml_diff>
--- a/base-de-datos/documentacion/entrega2/Entrega2_REDA.docx
+++ b/base-de-datos/documentacion/entrega2/Entrega2_REDA.docx
@@ -460,7 +460,7 @@
                 <w:rFonts w:ascii="Courier New" w:hAnsi="Courier New"/>
                 <w:sz w:val="18"/>
               </w:rPr>
-              <w:t>migraciones/001_ … 008_*.sql</w:t>
+              <w:t>migraciones/001_ … 009_*.sql</w:t>
             </w:r>
           </w:p>
         </w:tc>
@@ -474,7 +474,7 @@
               <w:rPr>
                 <w:sz w:val="20"/>
               </w:rPr>
-              <w:t>8 migraciones: PK, FK con política, NOT NULL, UNIQUE, CHECK, índices y vistas</w:t>
+              <w:t>9 migraciones: PK, FK con política, NOT NULL, UNIQUE, CHECK, índices y vistas</w:t>
             </w:r>
           </w:p>
         </w:tc>
@@ -564,7 +564,7 @@
               <w:rPr>
                 <w:sz w:val="20"/>
               </w:rPr>
-              <w:t>137 reportes de Valledupar, 18 incidentes, 9 casos; simulados y coherentes</w:t>
+              <w:t>137 reportes de Valledupar, 18 incidentes, 8 casos; simulados y coherentes</w:t>
             </w:r>
           </w:p>
         </w:tc>
@@ -1269,7 +1269,7 @@
           <w:b w:val="0"/>
           <w:i w:val="0"/>
         </w:rPr>
-        <w:t xml:space="preserve"> scripts/migrar.ps1 -Recrear crea la base desde cero y aplica las 8 migraciones sin errores; una segunda ejecución no reaplica ninguna.</w:t>
+        <w:t xml:space="preserve"> scripts/migrar.ps1 -Recrear crea la base desde cero y aplica las 9 migraciones sin errores; una segunda ejecución no reaplica ninguna.</w:t>
       </w:r>
     </w:p>
     <w:p>
@@ -1498,7 +1498,7 @@
               <w:rPr>
                 <w:sz w:val="20"/>
               </w:rPr>
-              <w:t>8,33 ms · 3 476 páginas</w:t>
+              <w:t>8,29 ms · 3 476 páginas</w:t>
             </w:r>
           </w:p>
         </w:tc>
@@ -1512,7 +1512,7 @@
               <w:rPr>
                 <w:sz w:val="20"/>
               </w:rPr>
-              <w:t>0,58 ms · 574 páginas</w:t>
+              <w:t>0,53 ms · 574 páginas</w:t>
             </w:r>
           </w:p>
         </w:tc>
@@ -1526,7 +1526,7 @@
               <w:rPr>
                 <w:sz w:val="20"/>
               </w:rPr>
-              <w:t>14× más rápido</w:t>
+              <w:t>15× más rápido</w:t>
             </w:r>
           </w:p>
         </w:tc>
@@ -1556,7 +1556,7 @@
               <w:rPr>
                 <w:sz w:val="20"/>
               </w:rPr>
-              <w:t>39,71 ms · Seq Scan de ≈ 400 000 filas</w:t>
+              <w:t>36,42 ms · Seq Scan de ≈ 400 000 filas</w:t>
             </w:r>
           </w:p>
         </w:tc>
@@ -1570,7 +1570,7 @@
               <w:rPr>
                 <w:sz w:val="20"/>
               </w:rPr>
-              <w:t>0,064 ms · 8 páginas</w:t>
+              <w:t>0,055 ms · 8 páginas</w:t>
             </w:r>
           </w:p>
         </w:tc>
@@ -1584,7 +1584,7 @@
               <w:rPr>
                 <w:sz w:val="20"/>
               </w:rPr>
-              <w:t>≈ 600× más rápido</w:t>
+              <w:t>≈ 650× más rápido</w:t>
             </w:r>
           </w:p>
         </w:tc>

</xml_diff>

<commit_message>
feat: agrega migración 011 de calificaciones de abogados
Una calificación (1 a 5, comentario opcional) por caso cerrado, del dueño
del caso al abogado elegido. El promedio se calcula en la vista
v_reputacion_abogados (no se almacena). Semilla, pruebas, documentación,
diccionario y PDF de Entrega 2 actualizados.

Co-Authored-By: Claude Opus 5.5 <noreply@anthropic.com>
</commit_message>
<xml_diff>
--- a/base-de-datos/documentacion/entrega2/Entrega2_REDA.docx
+++ b/base-de-datos/documentacion/entrega2/Entrega2_REDA.docx
@@ -460,7 +460,7 @@
                 <w:rFonts w:ascii="Courier New" w:hAnsi="Courier New"/>
                 <w:sz w:val="18"/>
               </w:rPr>
-              <w:t>migraciones/001_ … 009_*.sql</w:t>
+              <w:t>migraciones/001_ … 011_*.sql</w:t>
             </w:r>
           </w:p>
         </w:tc>
@@ -474,7 +474,7 @@
               <w:rPr>
                 <w:sz w:val="20"/>
               </w:rPr>
-              <w:t>9 migraciones: PK, FK con política, NOT NULL, UNIQUE, CHECK, índices y vistas</w:t>
+              <w:t>11 migraciones: PK, FK con política, NOT NULL, UNIQUE, CHECK, índices y vistas</w:t>
             </w:r>
           </w:p>
         </w:tc>
@@ -564,7 +564,7 @@
               <w:rPr>
                 <w:sz w:val="20"/>
               </w:rPr>
-              <w:t>137 reportes de Valledupar, 18 incidentes, 8 casos; simulados y coherentes</w:t>
+              <w:t>137 reportes de Valledupar, 18 incidentes, 9 casos; simulados y coherentes</w:t>
             </w:r>
           </w:p>
         </w:tc>
@@ -1014,7 +1014,7 @@
               <w:rPr>
                 <w:sz w:val="20"/>
               </w:rPr>
-              <w:t>19 inserciones inválidas que la base debe rechazar</w:t>
+              <w:t>27 inserciones inválidas que la base debe rechazar</w:t>
             </w:r>
           </w:p>
         </w:tc>
@@ -1269,7 +1269,7 @@
           <w:b w:val="0"/>
           <w:i w:val="0"/>
         </w:rPr>
-        <w:t xml:space="preserve"> scripts/migrar.ps1 -Recrear crea la base desde cero y aplica las 9 migraciones sin errores; una segunda ejecución no reaplica ninguna.</w:t>
+        <w:t xml:space="preserve"> scripts/migrar.ps1 -Recrear crea la base desde cero y aplica las 11 migraciones sin errores; una segunda ejecución no reaplica ninguna.</w:t>
       </w:r>
     </w:p>
     <w:p>
@@ -1296,7 +1296,7 @@
           <w:b w:val="0"/>
           <w:i w:val="0"/>
         </w:rPr>
-        <w:t xml:space="preserve"> las 19 pruebas negativas de sql/pruebas/probar_restricciones.sql son rechazadas, cada una por la restricción exacta que se esperaba (la prueba compara el nombre de la restricción).</w:t>
+        <w:t xml:space="preserve"> las 27 pruebas negativas de sql/pruebas/probar_restricciones.sql son rechazadas, cada una por la restricción exacta que se esperaba (la prueba compara el nombre de la restricción).</w:t>
       </w:r>
     </w:p>
     <w:p>
@@ -1323,7 +1323,7 @@
           <w:b w:val="0"/>
           <w:i w:val="0"/>
         </w:rPr>
-        <w:t xml:space="preserve"> las 11 comprobaciones de sql/pruebas/verificar_semilla.sql devuelven 0 (estado actual = último cambio del historial, hecho antes que el reporte, antecedentes dentro de 100 m, etc.).</w:t>
+        <w:t xml:space="preserve"> las 15 comprobaciones de sql/pruebas/verificar_semilla.sql devuelven 0 (estado actual = último cambio del historial, hecho antes que el reporte, antecedentes dentro de 100 m, etc.).</w:t>
       </w:r>
     </w:p>
     <w:p>
@@ -1498,7 +1498,7 @@
               <w:rPr>
                 <w:sz w:val="20"/>
               </w:rPr>
-              <w:t>8,29 ms · 3 476 páginas</w:t>
+              <w:t>8,39 ms · 3 477 páginas</w:t>
             </w:r>
           </w:p>
         </w:tc>
@@ -1512,7 +1512,7 @@
               <w:rPr>
                 <w:sz w:val="20"/>
               </w:rPr>
-              <w:t>0,53 ms · 574 páginas</w:t>
+              <w:t>0,54 ms · 574 páginas</w:t>
             </w:r>
           </w:p>
         </w:tc>
@@ -1556,7 +1556,7 @@
               <w:rPr>
                 <w:sz w:val="20"/>
               </w:rPr>
-              <w:t>36,42 ms · Seq Scan de ≈ 400 000 filas</w:t>
+              <w:t>39,44 ms · Seq Scan de ≈ 400 000 filas</w:t>
             </w:r>
           </w:p>
         </w:tc>
@@ -1570,7 +1570,7 @@
               <w:rPr>
                 <w:sz w:val="20"/>
               </w:rPr>
-              <w:t>0,055 ms · 8 páginas</w:t>
+              <w:t>0,069 ms · 8 páginas</w:t>
             </w:r>
           </w:p>
         </w:tc>
@@ -1584,7 +1584,7 @@
               <w:rPr>
                 <w:sz w:val="20"/>
               </w:rPr>
-              <w:t>≈ 650× más rápido</w:t>
+              <w:t>≈ 570× más rápido</w:t>
             </w:r>
           </w:p>
         </w:tc>

</xml_diff>

<commit_message>
actualizacion documento entrega 2
</commit_message>
<xml_diff>
--- a/base-de-datos/documentacion/entrega2/Entrega2_REDA.docx
+++ b/base-de-datos/documentacion/entrega2/Entrega2_REDA.docx
@@ -273,7 +273,21 @@
           <w:b w:val="0"/>
           <w:i w:val="0"/>
         </w:rPr>
-        <w:t xml:space="preserve">Todo lo entregado está en el repositorio, en la etiqueta </w:t>
+        <w:t xml:space="preserve">Los archivos de esta entrega se encuentran en la carpeta </w:t>
+      </w:r>
+      <w:r>
+        <w:rPr>
+          <w:b/>
+          <w:i w:val="0"/>
+        </w:rPr>
+        <w:t>base-de-datos/</w:t>
+      </w:r>
+      <w:r>
+        <w:rPr>
+          <w:b w:val="0"/>
+          <w:i w:val="0"/>
+        </w:rPr>
+        <w:t xml:space="preserve"> del repositorio. La etiqueta </w:t>
       </w:r>
       <w:r>
         <w:rPr>
@@ -287,21 +301,7 @@
           <w:b w:val="0"/>
           <w:i w:val="0"/>
         </w:rPr>
-        <w:t xml:space="preserve">, dentro de la carpeta </w:t>
-      </w:r>
-      <w:r>
-        <w:rPr>
-          <w:b/>
-          <w:i w:val="0"/>
-        </w:rPr>
-        <w:t>base-de-datos/</w:t>
-      </w:r>
-      <w:r>
-        <w:rPr>
-          <w:b w:val="0"/>
-          <w:i w:val="0"/>
-        </w:rPr>
-        <w:t xml:space="preserve"> (las rutas de este documento son relativas a ella):</w:t>
+        <w:t xml:space="preserve"> se creará después de revisar y aprobar la versión final. Las rutas de este documento son relativas a dicha carpeta:</w:t>
       </w:r>
     </w:p>
     <w:p>
@@ -460,7 +460,7 @@
                 <w:rFonts w:ascii="Courier New" w:hAnsi="Courier New"/>
                 <w:sz w:val="18"/>
               </w:rPr>
-              <w:t>migraciones/001_ … 013_*.sql</w:t>
+              <w:t>migraciones/001_ … 014_*.sql</w:t>
             </w:r>
           </w:p>
         </w:tc>
@@ -474,7 +474,7 @@
               <w:rPr>
                 <w:sz w:val="20"/>
               </w:rPr>
-              <w:t>13 migraciones: PK, FK con política, NOT NULL, UNIQUE, CHECK, índices y vistas</w:t>
+              <w:t>14 migraciones: PK, FK con política, NOT NULL, UNIQUE, CHECK, índices y vistas</w:t>
             </w:r>
           </w:p>
         </w:tc>
@@ -520,6 +520,51 @@
                 <w:sz w:val="20"/>
               </w:rPr>
               <w:t>Base vacía → migraciones en orden (cada una en su transacción)</w:t>
+            </w:r>
+          </w:p>
+        </w:tc>
+      </w:tr>
+      <w:tr>
+        <w:tc>
+          <w:tcPr>
+            <w:tcW w:type="dxa" w:w="2608"/>
+          </w:tcPr>
+          <w:p>
+            <w:r/>
+            <w:r>
+              <w:rPr>
+                <w:sz w:val="20"/>
+              </w:rPr>
+              <w:t xml:space="preserve">   Evidencia de verificación</w:t>
+            </w:r>
+          </w:p>
+        </w:tc>
+        <w:tc>
+          <w:tcPr>
+            <w:tcW w:type="dxa" w:w="3969"/>
+          </w:tcPr>
+          <w:p>
+            <w:r/>
+            <w:r>
+              <w:rPr>
+                <w:rFonts w:ascii="Courier New" w:hAnsi="Courier New"/>
+                <w:sz w:val="18"/>
+              </w:rPr>
+              <w:t>documentacion/entrega2/evidencia_verificacion.txt</w:t>
+            </w:r>
+          </w:p>
+        </w:tc>
+        <w:tc>
+          <w:tcPr>
+            <w:tcW w:type="dxa" w:w="2494"/>
+          </w:tcPr>
+          <w:p>
+            <w:r/>
+            <w:r>
+              <w:rPr>
+                <w:sz w:val="20"/>
+              </w:rPr>
+              <w:t>Salida real: 14 migraciones, semilla y verificaciones completas</w:t>
             </w:r>
           </w:p>
         </w:tc>
@@ -744,7 +789,97 @@
               <w:rPr>
                 <w:sz w:val="20"/>
               </w:rPr>
-              <w:t>Cada resultado recalculado por otro camino</w:t>
+              <w:t>10 consultas verificadas por caminos independientes</w:t>
+            </w:r>
+          </w:p>
+        </w:tc>
+      </w:tr>
+      <w:tr>
+        <w:tc>
+          <w:tcPr>
+            <w:tcW w:type="dxa" w:w="2608"/>
+          </w:tcPr>
+          <w:p>
+            <w:r/>
+            <w:r>
+              <w:rPr>
+                <w:sz w:val="20"/>
+              </w:rPr>
+              <w:t xml:space="preserve">   Demostración de tres casos</w:t>
+            </w:r>
+          </w:p>
+        </w:tc>
+        <w:tc>
+          <w:tcPr>
+            <w:tcW w:type="dxa" w:w="3969"/>
+          </w:tcPr>
+          <w:p>
+            <w:r/>
+            <w:r>
+              <w:rPr>
+                <w:rFonts w:ascii="Courier New" w:hAnsi="Courier New"/>
+                <w:sz w:val="18"/>
+              </w:rPr>
+              <w:t>sql/pruebas/demostracion_tres_casos.sql</w:t>
+            </w:r>
+          </w:p>
+        </w:tc>
+        <w:tc>
+          <w:tcPr>
+            <w:tcW w:type="dxa" w:w="2494"/>
+          </w:tcPr>
+          <w:p>
+            <w:r/>
+            <w:r>
+              <w:rPr>
+                <w:sz w:val="20"/>
+              </w:rPr>
+              <w:t>Guion de sustentación: relaciones múltiples, ausencia de relación y rechazos</w:t>
+            </w:r>
+          </w:p>
+        </w:tc>
+      </w:tr>
+      <w:tr>
+        <w:tc>
+          <w:tcPr>
+            <w:tcW w:type="dxa" w:w="2608"/>
+          </w:tcPr>
+          <w:p>
+            <w:r/>
+            <w:r>
+              <w:rPr>
+                <w:sz w:val="20"/>
+              </w:rPr>
+              <w:t xml:space="preserve">   Evidencia de tres casos</w:t>
+            </w:r>
+          </w:p>
+        </w:tc>
+        <w:tc>
+          <w:tcPr>
+            <w:tcW w:type="dxa" w:w="3969"/>
+          </w:tcPr>
+          <w:p>
+            <w:r/>
+            <w:r>
+              <w:rPr>
+                <w:rFonts w:ascii="Courier New" w:hAnsi="Courier New"/>
+                <w:sz w:val="18"/>
+              </w:rPr>
+              <w:t>documentacion/entrega2/evidencia_tres_casos.txt</w:t>
+            </w:r>
+          </w:p>
+        </w:tc>
+        <w:tc>
+          <w:tcPr>
+            <w:tcW w:type="dxa" w:w="2494"/>
+          </w:tcPr>
+          <w:p>
+            <w:r/>
+            <w:r>
+              <w:rPr>
+                <w:sz w:val="20"/>
+              </w:rPr>
+              <w:t>Salida registrada de la demostración</w:t>
             </w:r>
           </w:p>
         </w:tc>
@@ -1014,7 +1149,7 @@
               <w:rPr>
                 <w:sz w:val="20"/>
               </w:rPr>
-              <w:t>Por qué de cada decisión y supuestos pendientes</w:t>
+              <w:t>Decisiones D01–D33 y supuestos pendientes</w:t>
             </w:r>
           </w:p>
         </w:tc>
@@ -1059,7 +1194,7 @@
               <w:rPr>
                 <w:sz w:val="20"/>
               </w:rPr>
-              <w:t>32 operaciones inválidas que la base debe rechazar</w:t>
+              <w:t>35 operaciones inválidas que la base debe rechazar</w:t>
             </w:r>
           </w:p>
         </w:tc>
@@ -1359,7 +1494,7 @@
           <w:b w:val="0"/>
           <w:i w:val="0"/>
         </w:rPr>
-        <w:t xml:space="preserve"> scripts/migrar.ps1 -Recrear crea la base desde cero y aplica las 13 migraciones sin errores; una segunda ejecución no reaplica ninguna. scripts/verificar_desde_cero.ps1 repite todo el proceso en una base aparte y corre las pruebas de esta sección.</w:t>
+        <w:t xml:space="preserve"> la evidencia de verificación registra la aplicación de las 14 migraciones sin errores. scripts/verificar_desde_cero.ps1 permite repetir el proceso en una base aparte.</w:t>
       </w:r>
     </w:p>
     <w:p>
@@ -1386,7 +1521,7 @@
           <w:b w:val="0"/>
           <w:i w:val="0"/>
         </w:rPr>
-        <w:t xml:space="preserve"> las 32 pruebas negativas de sql/pruebas/probar_restricciones.sql son rechazadas, cada una por la restricción exacta que se esperaba (la prueba compara el nombre de la restricción).</w:t>
+        <w:t xml:space="preserve"> las 35 pruebas negativas de sql/pruebas/probar_restricciones.sql son rechazadas, cada una por la restricción exacta que se esperaba (la prueba compara el nombre de la restricción).</w:t>
       </w:r>
     </w:p>
     <w:p>
@@ -1413,7 +1548,7 @@
           <w:b w:val="0"/>
           <w:i w:val="0"/>
         </w:rPr>
-        <w:t xml:space="preserve"> las 15 comprobaciones de sql/pruebas/verificar_semilla.sql devuelven 0 (estado actual = último cambio del historial, hecho antes que el reporte, antecedentes dentro de 100 m, etc.).</w:t>
+        <w:t xml:space="preserve"> las 17 comprobaciones de sql/pruebas/verificar_semilla.sql devuelven 0 (estado actual = último cambio del historial, hecho antes que el reporte, antecedentes dentro de 100 m, etc.).</w:t>
       </w:r>
     </w:p>
     <w:p>
@@ -1441,6 +1576,33 @@
           <w:i w:val="0"/>
         </w:rPr>
         <w:t xml:space="preserve"> las 10 verificaciones cruzadas coinciden (por ejemplo, LEFT JOIN … IS NULL = NOT EXISTS = EXCEPT; el total facturado por abogado = el total cobrado por caso). C02 y C07 se comprobaron además a mano.</w:t>
+      </w:r>
+    </w:p>
+    <w:p>
+      <w:pPr>
+        <w:ind w:left="340"/>
+        <w:jc w:val="both"/>
+      </w:pPr>
+      <w:r>
+        <w:rPr>
+          <w:b w:val="0"/>
+          <w:i w:val="0"/>
+        </w:rPr>
+        <w:t xml:space="preserve">• </w:t>
+      </w:r>
+      <w:r>
+        <w:rPr>
+          <w:b/>
+          <w:i w:val="0"/>
+        </w:rPr>
+        <w:t>Tres casos de la rúbrica:</w:t>
+      </w:r>
+      <w:r>
+        <w:rPr>
+          <w:b w:val="0"/>
+          <w:i w:val="0"/>
+        </w:rPr>
+        <w:t xml:space="preserve"> la demostración muestra registros relacionados con varios, registros sin relación y cuatro operaciones rechazadas por restricciones. La salida está en documentacion/entrega2/evidencia_tres_casos.txt.</w:t>
       </w:r>
     </w:p>
     <w:p>

</xml_diff>

<commit_message>
Completa entrega de base de datos según rúbrica
</commit_message>
<xml_diff>
--- a/base-de-datos/documentacion/entrega2/Entrega2_REDA.docx
+++ b/base-de-datos/documentacion/entrega2/Entrega2_REDA.docx
@@ -261,7 +261,7 @@
           <w:b w:val="0"/>
           <w:i w:val="0"/>
         </w:rPr>
-        <w:t>. El ciudadano reporta condiciones (antecedentes) e incidentes (daños sufridos); el sistema vincula cada incidente con los reportes previos del mismo punto ("la entidad ya sabía") y, si el caso es viable, lo remite a un abogado. El esquema pasa de 10 a 23 tablas, y se conservan las 10 originales con sus políticas de borrado.</w:t>
+        <w:t>. El ciudadano reporta condiciones (antecedentes) e incidentes (daños sufridos); el sistema vincula cada incidente con los reportes previos del mismo punto ("la entidad ya sabía") y, si el caso es viable, lo remite a un abogado. El esquema pasa de 10 a 25 tablas, y se conservan las 10 originales con sus políticas de borrado.</w:t>
       </w:r>
     </w:p>
     <w:p>
@@ -460,7 +460,7 @@
                 <w:rFonts w:ascii="Courier New" w:hAnsi="Courier New"/>
                 <w:sz w:val="18"/>
               </w:rPr>
-              <w:t>migraciones/001_ … 014_*.sql</w:t>
+              <w:t>migraciones/001_ … 017_*.sql</w:t>
             </w:r>
           </w:p>
         </w:tc>
@@ -474,7 +474,7 @@
               <w:rPr>
                 <w:sz w:val="20"/>
               </w:rPr>
-              <w:t>14 migraciones: PK, FK con política, NOT NULL, UNIQUE, CHECK, índices y vistas</w:t>
+              <w:t>17 migraciones: PK, FK con política, NOT NULL, UNIQUE, CHECK, índices y vistas</w:t>
             </w:r>
           </w:p>
         </w:tc>
@@ -564,7 +564,7 @@
               <w:rPr>
                 <w:sz w:val="20"/>
               </w:rPr>
-              <w:t>Salida real: 14 migraciones, semilla y verificaciones completas</w:t>
+              <w:t>Salida real: 17 migraciones, semilla y verificaciones completas</w:t>
             </w:r>
           </w:p>
         </w:tc>
@@ -699,7 +699,7 @@
               <w:rPr>
                 <w:sz w:val="20"/>
               </w:rPr>
-              <w:t>DF y forma normal de las 23 tablas, con 6 observaciones justificadas (E1–E6)</w:t>
+              <w:t>DF y forma normal de las 25 tablas, con 6 observaciones justificadas (E1–E6)</w:t>
             </w:r>
           </w:p>
         </w:tc>
@@ -1059,7 +1059,7 @@
               <w:rPr>
                 <w:sz w:val="20"/>
               </w:rPr>
-              <w:t>23 tablas, 31 relaciones, notación pata de gallo</w:t>
+              <w:t>25 tablas, 33 relaciones, notación pata de gallo</w:t>
             </w:r>
           </w:p>
         </w:tc>
@@ -1194,7 +1194,7 @@
               <w:rPr>
                 <w:sz w:val="20"/>
               </w:rPr>
-              <w:t>35 operaciones inválidas que la base debe rechazar</w:t>
+              <w:t>40 operaciones inválidas que la base debe rechazar</w:t>
             </w:r>
           </w:p>
         </w:tc>
@@ -1494,7 +1494,7 @@
           <w:b w:val="0"/>
           <w:i w:val="0"/>
         </w:rPr>
-        <w:t xml:space="preserve"> la evidencia de verificación registra la aplicación de las 14 migraciones sin errores. scripts/verificar_desde_cero.ps1 permite repetir el proceso en una base aparte.</w:t>
+        <w:t xml:space="preserve"> la evidencia de verificación registra la aplicación de las 17 migraciones sin errores. scripts/verificar_desde_cero.ps1 permite repetir el proceso en una base aparte.</w:t>
       </w:r>
     </w:p>
     <w:p>
@@ -1521,7 +1521,7 @@
           <w:b w:val="0"/>
           <w:i w:val="0"/>
         </w:rPr>
-        <w:t xml:space="preserve"> las 35 pruebas negativas de sql/pruebas/probar_restricciones.sql son rechazadas, cada una por la restricción exacta que se esperaba (la prueba compara el nombre de la restricción).</w:t>
+        <w:t xml:space="preserve"> las 40 pruebas negativas de sql/pruebas/probar_restricciones.sql son rechazadas, cada una por la restricción exacta que se esperaba (la prueba compara el nombre de la restricción).</w:t>
       </w:r>
     </w:p>
     <w:p>
@@ -1548,7 +1548,7 @@
           <w:b w:val="0"/>
           <w:i w:val="0"/>
         </w:rPr>
-        <w:t xml:space="preserve"> las 17 comprobaciones de sql/pruebas/verificar_semilla.sql devuelven 0 (estado actual = último cambio del historial, hecho antes que el reporte, antecedentes dentro de 100 m, etc.).</w:t>
+        <w:t xml:space="preserve"> las 19 comprobaciones de sql/pruebas/verificar_semilla.sql devuelven 0 (estado actual = último cambio del historial, hecho antes que el reporte, antecedentes dentro de 100 m, etc.).</w:t>
       </w:r>
     </w:p>
     <w:p>
@@ -1875,7 +1875,7 @@
       <w:r>
         <w:drawing>
           <wp:inline xmlns:a="http://schemas.openxmlformats.org/drawingml/2006/main" xmlns:pic="http://schemas.openxmlformats.org/drawingml/2006/picture">
-            <wp:extent cx="5760000" cy="2987841"/>
+            <wp:extent cx="5760000" cy="3561938"/>
             <wp:docPr id="1" name="Picture 1"/>
             <wp:cNvGraphicFramePr>
               <a:graphicFrameLocks noChangeAspect="1"/>
@@ -1896,7 +1896,7 @@
                   <pic:spPr>
                     <a:xfrm>
                       <a:off x="0" y="0"/>
-                      <a:ext cx="5760000" cy="2987841"/>
+                      <a:ext cx="5760000" cy="3561938"/>
                     </a:xfrm>
                     <a:prstGeom prst="rect"/>
                   </pic:spPr>

</xml_diff>

<commit_message>
feat: persist calendar dates as DATE
</commit_message>
<xml_diff>
--- a/base-de-datos/documentacion/entrega2/Entrega2_REDA.docx
+++ b/base-de-datos/documentacion/entrega2/Entrega2_REDA.docx
@@ -460,7 +460,7 @@
                 <w:rFonts w:ascii="Courier New" w:hAnsi="Courier New"/>
                 <w:sz w:val="18"/>
               </w:rPr>
-              <w:t>migraciones/001_ … 017_*.sql</w:t>
+              <w:t>migraciones/001_ … 018_*.sql</w:t>
             </w:r>
           </w:p>
         </w:tc>
@@ -474,7 +474,7 @@
               <w:rPr>
                 <w:sz w:val="20"/>
               </w:rPr>
-              <w:t>17 migraciones: PK, FK con política, NOT NULL, UNIQUE, CHECK, índices y vistas</w:t>
+              <w:t>18 migraciones: PK, FK con política, NOT NULL, UNIQUE, CHECK, índices, vistas y fechas DATE</w:t>
             </w:r>
           </w:p>
         </w:tc>
@@ -564,7 +564,7 @@
               <w:rPr>
                 <w:sz w:val="20"/>
               </w:rPr>
-              <w:t>Salida real: 17 migraciones, semilla y verificaciones completas</w:t>
+              <w:t>Salida real: 18 migraciones, semilla y verificaciones completas</w:t>
             </w:r>
           </w:p>
         </w:tc>
@@ -1149,7 +1149,7 @@
               <w:rPr>
                 <w:sz w:val="20"/>
               </w:rPr>
-              <w:t>Decisiones D01–D33 y supuestos pendientes</w:t>
+              <w:t>Decisiones D01–D34 y supuestos pendientes</w:t>
             </w:r>
           </w:p>
         </w:tc>
@@ -1634,6 +1634,33 @@
     </w:p>
     <w:p>
       <w:pPr>
+        <w:ind w:left="340"/>
+        <w:jc w:val="both"/>
+      </w:pPr>
+      <w:r>
+        <w:rPr>
+          <w:b w:val="0"/>
+          <w:i w:val="0"/>
+        </w:rPr>
+        <w:t xml:space="preserve">• </w:t>
+      </w:r>
+      <w:r>
+        <w:rPr>
+          <w:b/>
+          <w:i w:val="0"/>
+        </w:rPr>
+        <w:t>Fechas:</w:t>
+      </w:r>
+      <w:r>
+        <w:rPr>
+          <w:b w:val="0"/>
+          <w:i w:val="0"/>
+        </w:rPr>
+        <w:t xml:space="preserve"> la migración 018 convierte las 26 fechas persistidas a DATE en la zona America/Bogota. Los antecedentes requieren un día previo y los cambios del historial se ordenan por id_historial (D34).</w:t>
+      </w:r>
+    </w:p>
+    <w:p>
+      <w:pPr>
         <w:spacing w:before="240"/>
       </w:pPr>
       <w:r>

</xml_diff>

<commit_message>
docs(bd): actualiza decisiones, correcciones, diccionario, evidencia y documento a 17 migraciones
</commit_message>
<xml_diff>
--- a/base-de-datos/documentacion/entrega2/Entrega2_REDA.docx
+++ b/base-de-datos/documentacion/entrega2/Entrega2_REDA.docx
@@ -460,7 +460,7 @@
                 <w:rFonts w:ascii="Courier New" w:hAnsi="Courier New"/>
                 <w:sz w:val="18"/>
               </w:rPr>
-              <w:t>migraciones/001_ … 018_*.sql</w:t>
+              <w:t>migraciones/001_ … 017_*.sql</w:t>
             </w:r>
           </w:p>
         </w:tc>
@@ -474,7 +474,7 @@
               <w:rPr>
                 <w:sz w:val="20"/>
               </w:rPr>
-              <w:t>18 migraciones: PK, FK con política, NOT NULL, UNIQUE, CHECK, índices, vistas y fechas DATE</w:t>
+              <w:t>17 migraciones: PK, FK con política, NOT NULL, UNIQUE, CHECK, índices, vistas y fechas DATE</w:t>
             </w:r>
           </w:p>
         </w:tc>
@@ -564,7 +564,7 @@
               <w:rPr>
                 <w:sz w:val="20"/>
               </w:rPr>
-              <w:t>Salida real: 18 migraciones, semilla y verificaciones completas</w:t>
+              <w:t>Salida real: 17 migraciones, semilla y verificaciones completas</w:t>
             </w:r>
           </w:p>
         </w:tc>
@@ -1656,7 +1656,7 @@
           <w:b w:val="0"/>
           <w:i w:val="0"/>
         </w:rPr>
-        <w:t xml:space="preserve"> la migración 018 convierte las 26 fechas persistidas a DATE en la zona America/Bogota. Los antecedentes requieren un día previo y los cambios del historial se ordenan por id_historial (D34).</w:t>
+        <w:t xml:space="preserve"> las 26 fechas persistidas se declaran como DATE en la migración que crea cada tabla. Los antecedentes requieren un día previo y los cambios del historial se ordenan por id_historial (D34).</w:t>
       </w:r>
     </w:p>
     <w:p>

</xml_diff>